<commit_message>
feat: rebuild site as hire-focused AI QA & evaluation portfolio
Position Katie for remote AI QA / LLM evaluation work: evaluation section, case studies with artifacts, AI QA one-pager PDF, LinkedIn CTAs, and recruiter SEO/OG/JSON-LD.
</commit_message>
<xml_diff>
--- a/public/Katie-Kinkel-Resume.docx
+++ b/public/Katie-Kinkel-Resume.docx
@@ -27,14 +27,14 @@
           <w:sz w:val="24"/>
           <w:szCs w:val="24"/>
         </w:rPr>
-        <w:t xml:space="preserve">AI-fluent QA &amp; operations generalist</w:t>
+        <w:t xml:space="preserve">AI QA, Evaluation &amp; Operations Specialist</w:t>
       </w:r>
     </w:p>
     <w:p>
       <w:pPr>
         <w:spacing w:after="160" w:before="0"/>
       </w:pPr>
-      <w:hyperlink w:history="1" r:id="rIdtuvys4sybaj2aqy_4tylb">
+      <w:hyperlink w:history="1" r:id="rIdmugq0w80mwmcebjkqlzce">
         <w:r>
           <w:rPr>
             <w:color w:val="3B7A68"/>
@@ -53,7 +53,7 @@
         </w:rPr>
         <w:t xml:space="preserve">   ·   </w:t>
       </w:r>
-      <w:hyperlink w:history="1" r:id="rIdfrf3kw8pzpiumpcdgtxc2">
+      <w:hyperlink w:history="1" r:id="rIdvnsa4nul9giyecyiptky5">
         <w:r>
           <w:rPr>
             <w:color w:val="3B7A68"/>
@@ -64,6 +64,25 @@
           <w:t xml:space="preserve">ktkinkel@gmail.com</w:t>
         </w:r>
       </w:hyperlink>
+      <w:r>
+        <w:rPr>
+          <w:color w:val="5B6B66"/>
+          <w:sz w:val="18"/>
+          <w:szCs w:val="18"/>
+        </w:rPr>
+        <w:t xml:space="preserve">   ·   </w:t>
+      </w:r>
+      <w:hyperlink w:history="1" r:id="rIdrb_8ykjdxxtwgdje43-mp">
+        <w:r>
+          <w:rPr>
+            <w:color w:val="3B7A68"/>
+            <w:sz w:val="18"/>
+            <w:szCs w:val="18"/>
+            <w:u w:val="single"/>
+          </w:rPr>
+          <w:t xml:space="preserve">LinkedIn</w:t>
+        </w:r>
+      </w:hyperlink>
     </w:p>
     <w:p>
       <w:pPr>
@@ -77,7 +96,7 @@
           <w:sz w:val="19"/>
           <w:szCs w:val="19"/>
         </w:rPr>
-        <w:t xml:space="preserve">Personable, motivated problem-solver who resolves issues with grace. After Spotify Creative Support and QA Buddy work, deepened fluency with AI tools for virtually every organizational skill companies need — always with a human QA pass before anything ships.</w:t>
+        <w:t xml:space="preserve">AI QA, Evaluation &amp; Operations Specialist with 3+ years of Spotify support QA via 24-7 Intouch. Evaluates LLM output for instruction following, accuracy, tone, and hallucinations — then organizes AI-assisted ops work so teams can ship with confidence.</w:t>
       </w:r>
     </w:p>
     <w:p>
@@ -122,7 +141,7 @@
           <w:sz w:val="22"/>
           <w:szCs w:val="22"/>
         </w:rPr>
-        <w:t xml:space="preserve">AI-augmented generalist</w:t>
+        <w:t xml:space="preserve">Independent AI QA &amp; Evaluation Specialist</w:t>
       </w:r>
       <w:r>
         <w:t xml:space="preserve">	</w:t>
@@ -179,7 +198,7 @@
           <w:sz w:val="18"/>
           <w:szCs w:val="18"/>
         </w:rPr>
-        <w:t xml:space="preserve">Uses Cursor, GitHub Copilot, and ChatGPT for research, drafting, QA, prototyping, and operations. Builds websites, writes association minutes, supports community and caretaking workflows, and treats human review as the quality gate on every deliverable.</w:t>
+        <w:t xml:space="preserve">LLM evaluation, human-in-the-loop review, and AI-assisted operations. Uses Cursor, GitHub Copilot, and ChatGPT for research, drafting, QA, prototyping, and ops — with human review as the quality gate on every deliverable.</w:t>
       </w:r>
     </w:p>
     <w:p>
@@ -697,7 +716,7 @@
           <w:sz w:val="18"/>
           <w:szCs w:val="18"/>
         </w:rPr>
-        <w:t xml:space="preserve">Surfaces: Cursor · Copilot · ChatGPT. Families: GPT · Codex · Claude Opus · Claude Sonnet · Claude Fable · Claude Haiku · Gemini · Grok · Composer. Versions rotate; human QA does not.</w:t>
+        <w:t xml:space="preserve">Surfaces: Cursor · Copilot · ChatGPT. Families: GPT · Claude · Gemini · Grok · Codex · Composer. Versions rotate; human QA does not.</w:t>
       </w:r>
     </w:p>
     <w:sectPr>

</xml_diff>